<commit_message>
feat: implement document template management system with rich-text editing and print-to-PDF functionality
</commit_message>
<xml_diff>
--- a/public/templates/Exit Interview - SR.docx
+++ b/public/templates/Exit Interview - SR.docx
@@ -88,24 +88,6 @@
                 <w:szCs w:val="24"/>
               </w:rPr>
             </w:pPr>
-            <w:r>
-              <w:rPr>
-                <w:rFonts w:ascii="Barlow" w:eastAsia="Barlow" w:hAnsi="Barlow" w:cs="Barlow"/>
-                <w:sz w:val="24"/>
-                <w:szCs w:val="24"/>
-              </w:rPr>
-              <w:t xml:space="preserve">Patricia Mae L. </w:t>
-            </w:r>
-            <w:proofErr w:type="spellStart"/>
-            <w:r>
-              <w:rPr>
-                <w:rFonts w:ascii="Barlow" w:eastAsia="Barlow" w:hAnsi="Barlow" w:cs="Barlow"/>
-                <w:sz w:val="24"/>
-                <w:szCs w:val="24"/>
-              </w:rPr>
-              <w:t>Minimo</w:t>
-            </w:r>
-            <w:proofErr w:type="spellEnd"/>
           </w:p>
         </w:tc>
       </w:tr>
@@ -164,14 +146,6 @@
                 <w:szCs w:val="24"/>
               </w:rPr>
             </w:pPr>
-            <w:r>
-              <w:rPr>
-                <w:rFonts w:ascii="Barlow" w:eastAsia="Barlow" w:hAnsi="Barlow" w:cs="Barlow"/>
-                <w:sz w:val="24"/>
-                <w:szCs w:val="24"/>
-              </w:rPr>
-              <w:t>Marketing Officer I</w:t>
-            </w:r>
           </w:p>
         </w:tc>
       </w:tr>
@@ -230,14 +204,6 @@
                 <w:szCs w:val="24"/>
               </w:rPr>
             </w:pPr>
-            <w:r>
-              <w:rPr>
-                <w:rFonts w:ascii="Barlow" w:eastAsia="Barlow" w:hAnsi="Barlow" w:cs="Barlow"/>
-                <w:sz w:val="24"/>
-                <w:szCs w:val="24"/>
-              </w:rPr>
-              <w:t>Marketing</w:t>
-            </w:r>
           </w:p>
         </w:tc>
       </w:tr>
@@ -296,14 +262,6 @@
                 <w:szCs w:val="24"/>
               </w:rPr>
             </w:pPr>
-            <w:r>
-              <w:rPr>
-                <w:rFonts w:ascii="Barlow" w:eastAsia="Barlow" w:hAnsi="Barlow" w:cs="Barlow"/>
-                <w:sz w:val="24"/>
-                <w:szCs w:val="24"/>
-              </w:rPr>
-              <w:t>April 28, 2026</w:t>
-            </w:r>
           </w:p>
         </w:tc>
       </w:tr>
@@ -362,14 +320,6 @@
                 <w:szCs w:val="24"/>
               </w:rPr>
             </w:pPr>
-            <w:r>
-              <w:rPr>
-                <w:rFonts w:ascii="Barlow" w:eastAsia="Barlow" w:hAnsi="Barlow" w:cs="Barlow"/>
-                <w:sz w:val="24"/>
-                <w:szCs w:val="24"/>
-              </w:rPr>
-              <w:t>Katrina Pauline M. Trinidad</w:t>
-            </w:r>
           </w:p>
         </w:tc>
       </w:tr>
@@ -931,25 +881,7 @@
                 <w:sz w:val="24"/>
                 <w:szCs w:val="24"/>
               </w:rPr>
-              <w:t xml:space="preserve">“What I valued most was the strong sense of teamwork among colleagues. They made the </w:t>
-            </w:r>
-            <w:proofErr w:type="gramStart"/>
-            <w:r>
-              <w:rPr>
-                <w:rFonts w:ascii="Barlow" w:eastAsia="Barlow" w:hAnsi="Barlow" w:cs="Barlow"/>
-                <w:sz w:val="24"/>
-                <w:szCs w:val="24"/>
-              </w:rPr>
-              <w:t>day to day</w:t>
-            </w:r>
-            <w:proofErr w:type="gramEnd"/>
-            <w:r>
-              <w:rPr>
-                <w:rFonts w:ascii="Barlow" w:eastAsia="Barlow" w:hAnsi="Barlow" w:cs="Barlow"/>
-                <w:sz w:val="24"/>
-                <w:szCs w:val="24"/>
-              </w:rPr>
-              <w:t xml:space="preserve"> work more manageable and enjoyable. I also appreciated the company culture, which fostered collaboration and a positive working environment.”</w:t>
+              <w:t>“What I valued most was the strong sense of teamwork among colleagues. They made the day to day work more manageable and enjoyable. I also appreciated the company culture, which fostered collaboration and a positive working environment.”</w:t>
             </w:r>
           </w:p>
         </w:tc>
@@ -1163,54 +1095,6 @@
           <w:szCs w:val="24"/>
         </w:rPr>
       </w:pPr>
-      <w:r>
-        <w:rPr>
-          <w:noProof/>
-        </w:rPr>
-        <w:drawing>
-          <wp:anchor distT="114300" distB="114300" distL="114300" distR="114300" simplePos="0" relativeHeight="251659264" behindDoc="1" locked="0" layoutInCell="1" hidden="0" allowOverlap="1" wp14:anchorId="44135540" wp14:editId="34BA61D3">
-            <wp:simplePos x="0" y="0"/>
-            <wp:positionH relativeFrom="column">
-              <wp:posOffset>0</wp:posOffset>
-            </wp:positionH>
-            <wp:positionV relativeFrom="paragraph">
-              <wp:posOffset>113665</wp:posOffset>
-            </wp:positionV>
-            <wp:extent cx="1929517" cy="1066800"/>
-            <wp:effectExtent l="0" t="0" r="0" b="0"/>
-            <wp:wrapNone/>
-            <wp:docPr id="2" name="image1.jpg"/>
-            <wp:cNvGraphicFramePr/>
-            <a:graphic xmlns:a="http://schemas.openxmlformats.org/drawingml/2006/main">
-              <a:graphicData uri="http://schemas.openxmlformats.org/drawingml/2006/picture">
-                <pic:pic xmlns:pic="http://schemas.openxmlformats.org/drawingml/2006/picture">
-                  <pic:nvPicPr>
-                    <pic:cNvPr id="0" name="image1.jpg"/>
-                    <pic:cNvPicPr preferRelativeResize="0"/>
-                  </pic:nvPicPr>
-                  <pic:blipFill>
-                    <a:blip r:embed="rId7"/>
-                    <a:srcRect/>
-                    <a:stretch>
-                      <a:fillRect/>
-                    </a:stretch>
-                  </pic:blipFill>
-                  <pic:spPr>
-                    <a:xfrm>
-                      <a:off x="0" y="0"/>
-                      <a:ext cx="1929517" cy="1066800"/>
-                    </a:xfrm>
-                    <a:prstGeom prst="rect">
-                      <a:avLst/>
-                    </a:prstGeom>
-                    <a:ln/>
-                  </pic:spPr>
-                </pic:pic>
-              </a:graphicData>
-            </a:graphic>
-          </wp:anchor>
-        </w:drawing>
-      </w:r>
     </w:p>
     <w:p>
       <w:pPr>
@@ -1287,7 +1171,7 @@
       </w:r>
     </w:p>
     <w:sectPr>
-      <w:headerReference w:type="default" r:id="rId8"/>
+      <w:headerReference w:type="default" r:id="rId7"/>
       <w:pgSz w:w="12240" w:h="18720"/>
       <w:pgMar w:top="1440" w:right="1440" w:bottom="1440" w:left="1440" w:header="720" w:footer="720" w:gutter="0"/>
       <w:pgNumType w:start="1"/>

</xml_diff>